<commit_message>
Add figures to the paper tables draft; name Uruguay and Bolivia in the quintile panel; occupation-split figure
Co-Authored-By: Claude Fable 5.1 <noreply@anthropic.com>
</commit_message>
<xml_diff>
--- a/docs/design/paper-tables-draft.docx
+++ b/docs/design/paper-tables-draft.docx
@@ -25,7 +25,7 @@
           <w:i/>
           <w:color w:val="555555"/>
         </w:rPr>
-        <w:t>Draft exhibits for the paper outline, generated 16 September 2026 from the ai-lfs-panel repository (commit 6f61062 and later). Tables 1 and 2 follow the outline; Figures 1 to 5 are given here as tables of the plotted values. All estimates use the top employment-weighted exposure quintile as the treated group unless stated.</w:t>
+        <w:t>Draft exhibits for the paper outline, generated 16 September 2026 from the ai-lfs-panel repository (commit 6f61062 and later). Tables 1 and 2 follow the outline; Figures 1 to 5 are shown with the plotted values as tables beneath them. All estimates use the top employment-weighted exposure quintile as the treated group unless stated.</w:t>
       </w:r>
     </w:p>
     <w:p>
@@ -5506,7 +5506,125 @@
         <w:pStyle w:val="Heading1"/>
       </w:pPr>
       <w:r>
-        <w:t>5. Figure 1 (as table). Event-study coefficients, log employment, pooled sample</w:t>
+        <w:t>5. Figure 1. Event-study coefficients, log employment, pooled sample</w:t>
+      </w:r>
+    </w:p>
+    <w:p>
+      <w:pPr>
+        <w:jc w:val="center"/>
+      </w:pPr>
+      <w:r>
+        <w:drawing>
+          <wp:inline xmlns:a="http://schemas.openxmlformats.org/drawingml/2006/main" xmlns:pic="http://schemas.openxmlformats.org/drawingml/2006/picture">
+            <wp:extent cx="5943600" cy="3396343"/>
+            <wp:docPr id="1" name="Picture 1"/>
+            <wp:cNvGraphicFramePr>
+              <a:graphicFrameLocks noChangeAspect="1"/>
+            </wp:cNvGraphicFramePr>
+            <a:graphic>
+              <a:graphicData uri="http://schemas.openxmlformats.org/drawingml/2006/picture">
+                <pic:pic>
+                  <pic:nvPicPr>
+                    <pic:cNvPr id="0" name="es_log_emp_all.png"/>
+                    <pic:cNvPicPr/>
+                  </pic:nvPicPr>
+                  <pic:blipFill>
+                    <a:blip r:embed="rId9"/>
+                    <a:stretch>
+                      <a:fillRect/>
+                    </a:stretch>
+                  </pic:blipFill>
+                  <pic:spPr>
+                    <a:xfrm>
+                      <a:off x="0" y="0"/>
+                      <a:ext cx="5943600" cy="3396343"/>
+                    </a:xfrm>
+                    <a:prstGeom prst="rect"/>
+                  </pic:spPr>
+                </pic:pic>
+              </a:graphicData>
+            </a:graphic>
+          </wp:inline>
+        </w:drawing>
+      </w:r>
+    </w:p>
+    <w:p>
+      <w:pPr>
+        <w:spacing w:after="200"/>
+      </w:pPr>
+      <w:r>
+        <w:rPr>
+          <w:b w:val="0"/>
+          <w:i/>
+          <w:color w:val="555555"/>
+          <w:sz w:val="17"/>
+        </w:rPr>
+        <w:t>Figure 1. Coefficients on high exposure (top quintile) × quarter, log cell employment, eleven countries pooled, with 95 percent confidence bands; reference 2022Q4 (dashed line).</w:t>
+      </w:r>
+    </w:p>
+    <w:p>
+      <w:pPr>
+        <w:jc w:val="center"/>
+      </w:pPr>
+      <w:r>
+        <w:drawing>
+          <wp:inline xmlns:a="http://schemas.openxmlformats.org/drawingml/2006/main" xmlns:pic="http://schemas.openxmlformats.org/drawingml/2006/picture">
+            <wp:extent cx="5943600" cy="3396343"/>
+            <wp:docPr id="2" name="Picture 2"/>
+            <wp:cNvGraphicFramePr>
+              <a:graphicFrameLocks noChangeAspect="1"/>
+            </wp:cNvGraphicFramePr>
+            <a:graphic>
+              <a:graphicData uri="http://schemas.openxmlformats.org/drawingml/2006/picture">
+                <pic:pic>
+                  <pic:nvPicPr>
+                    <pic:cNvPr id="0" name="es_log_emp_young.png"/>
+                    <pic:cNvPicPr/>
+                  </pic:nvPicPr>
+                  <pic:blipFill>
+                    <a:blip r:embed="rId10"/>
+                    <a:stretch>
+                      <a:fillRect/>
+                    </a:stretch>
+                  </pic:blipFill>
+                  <pic:spPr>
+                    <a:xfrm>
+                      <a:off x="0" y="0"/>
+                      <a:ext cx="5943600" cy="3396343"/>
+                    </a:xfrm>
+                    <a:prstGeom prst="rect"/>
+                  </pic:spPr>
+                </pic:pic>
+              </a:graphicData>
+            </a:graphic>
+          </wp:inline>
+        </w:drawing>
+      </w:r>
+    </w:p>
+    <w:p>
+      <w:pPr>
+        <w:spacing w:after="200"/>
+      </w:pPr>
+      <w:r>
+        <w:rPr>
+          <w:b w:val="0"/>
+          <w:i/>
+          <w:color w:val="555555"/>
+          <w:sz w:val="17"/>
+        </w:rPr>
+        <w:t>Figure 1b. Same specification, cells of workers aged 15 to 29 only.</w:t>
+      </w:r>
+    </w:p>
+    <w:p>
+      <w:pPr>
+        <w:spacing w:after="60"/>
+      </w:pPr>
+      <w:r>
+        <w:rPr>
+          <w:b/>
+          <w:i w:val="0"/>
+        </w:rPr>
+        <w:t>The same coefficients as a table:</w:t>
       </w:r>
     </w:p>
     <w:tbl>
@@ -7641,7 +7759,72 @@
         <w:pStyle w:val="Heading1"/>
       </w:pPr>
       <w:r>
-        <w:t>6. Figure 2 (as table). Employment index by exposure quintile, 2022 = 100</w:t>
+        <w:t>6. Figure 2. Employment index by exposure quintile, 2022 = 100</w:t>
+      </w:r>
+    </w:p>
+    <w:p>
+      <w:pPr>
+        <w:jc w:val="center"/>
+      </w:pPr>
+      <w:r>
+        <w:drawing>
+          <wp:inline xmlns:a="http://schemas.openxmlformats.org/drawingml/2006/main" xmlns:pic="http://schemas.openxmlformats.org/drawingml/2006/picture">
+            <wp:extent cx="5943600" cy="5849257"/>
+            <wp:docPr id="3" name="Picture 3"/>
+            <wp:cNvGraphicFramePr>
+              <a:graphicFrameLocks noChangeAspect="1"/>
+            </wp:cNvGraphicFramePr>
+            <a:graphic>
+              <a:graphicData uri="http://schemas.openxmlformats.org/drawingml/2006/picture">
+                <pic:pic>
+                  <pic:nvPicPr>
+                    <pic:cNvPr id="0" name="emp_index_q5_panel.png"/>
+                    <pic:cNvPicPr/>
+                  </pic:nvPicPr>
+                  <pic:blipFill>
+                    <a:blip r:embed="rId11"/>
+                    <a:stretch>
+                      <a:fillRect/>
+                    </a:stretch>
+                  </pic:blipFill>
+                  <pic:spPr>
+                    <a:xfrm>
+                      <a:off x="0" y="0"/>
+                      <a:ext cx="5943600" cy="5849257"/>
+                    </a:xfrm>
+                    <a:prstGeom prst="rect"/>
+                  </pic:spPr>
+                </pic:pic>
+              </a:graphicData>
+            </a:graphic>
+          </wp:inline>
+        </w:drawing>
+      </w:r>
+    </w:p>
+    <w:p>
+      <w:pPr>
+        <w:spacing w:after="200"/>
+      </w:pPr>
+      <w:r>
+        <w:rPr>
+          <w:b w:val="0"/>
+          <w:i/>
+          <w:color w:val="555555"/>
+          <w:sz w:val="17"/>
+        </w:rPr>
+        <w:t>Figure 2. Employment by quintile of generative-AI exposure, each quintile indexed to its 2022 mean, by country and pooled. Quintile 5 (red) is the most exposed.</w:t>
+      </w:r>
+    </w:p>
+    <w:p>
+      <w:pPr>
+        <w:spacing w:after="60"/>
+      </w:pPr>
+      <w:r>
+        <w:rPr>
+          <w:b/>
+          <w:i w:val="0"/>
+        </w:rPr>
+        <w:t>Selected values as a table:</w:t>
       </w:r>
     </w:p>
     <w:tbl>
@@ -12362,7 +12545,125 @@
         <w:pStyle w:val="Heading1"/>
       </w:pPr>
       <w:r>
-        <w:t>7. Figure 3 (as table). Event-study coefficients, new-hire share</w:t>
+        <w:t>7. Figure 3. Event-study coefficients, new-hire share</w:t>
+      </w:r>
+    </w:p>
+    <w:p>
+      <w:pPr>
+        <w:jc w:val="center"/>
+      </w:pPr>
+      <w:r>
+        <w:drawing>
+          <wp:inline xmlns:a="http://schemas.openxmlformats.org/drawingml/2006/main" xmlns:pic="http://schemas.openxmlformats.org/drawingml/2006/picture">
+            <wp:extent cx="5943600" cy="3396343"/>
+            <wp:docPr id="4" name="Picture 4"/>
+            <wp:cNvGraphicFramePr>
+              <a:graphicFrameLocks noChangeAspect="1"/>
+            </wp:cNvGraphicFramePr>
+            <a:graphic>
+              <a:graphicData uri="http://schemas.openxmlformats.org/drawingml/2006/picture">
+                <pic:pic>
+                  <pic:nvPicPr>
+                    <pic:cNvPr id="0" name="es_new_hire_share_young.png"/>
+                    <pic:cNvPicPr/>
+                  </pic:nvPicPr>
+                  <pic:blipFill>
+                    <a:blip r:embed="rId12"/>
+                    <a:stretch>
+                      <a:fillRect/>
+                    </a:stretch>
+                  </pic:blipFill>
+                  <pic:spPr>
+                    <a:xfrm>
+                      <a:off x="0" y="0"/>
+                      <a:ext cx="5943600" cy="3396343"/>
+                    </a:xfrm>
+                    <a:prstGeom prst="rect"/>
+                  </pic:spPr>
+                </pic:pic>
+              </a:graphicData>
+            </a:graphic>
+          </wp:inline>
+        </w:drawing>
+      </w:r>
+    </w:p>
+    <w:p>
+      <w:pPr>
+        <w:spacing w:after="200"/>
+      </w:pPr>
+      <w:r>
+        <w:rPr>
+          <w:b w:val="0"/>
+          <w:i/>
+          <w:color w:val="555555"/>
+          <w:sz w:val="17"/>
+        </w:rPr>
+        <w:t>Figure 3. Coefficients on high exposure × quarter for the new-hire share (workers in their job under 12 months), cells of workers aged 15 to 29, seven countries with a tenure question; 95 percent bands.</w:t>
+      </w:r>
+    </w:p>
+    <w:p>
+      <w:pPr>
+        <w:jc w:val="center"/>
+      </w:pPr>
+      <w:r>
+        <w:drawing>
+          <wp:inline xmlns:a="http://schemas.openxmlformats.org/drawingml/2006/main" xmlns:pic="http://schemas.openxmlformats.org/drawingml/2006/picture">
+            <wp:extent cx="5943600" cy="3396343"/>
+            <wp:docPr id="5" name="Picture 5"/>
+            <wp:cNvGraphicFramePr>
+              <a:graphicFrameLocks noChangeAspect="1"/>
+            </wp:cNvGraphicFramePr>
+            <a:graphic>
+              <a:graphicData uri="http://schemas.openxmlformats.org/drawingml/2006/picture">
+                <pic:pic>
+                  <pic:nvPicPr>
+                    <pic:cNvPr id="0" name="es_new_hire_share_all.png"/>
+                    <pic:cNvPicPr/>
+                  </pic:nvPicPr>
+                  <pic:blipFill>
+                    <a:blip r:embed="rId13"/>
+                    <a:stretch>
+                      <a:fillRect/>
+                    </a:stretch>
+                  </pic:blipFill>
+                  <pic:spPr>
+                    <a:xfrm>
+                      <a:off x="0" y="0"/>
+                      <a:ext cx="5943600" cy="3396343"/>
+                    </a:xfrm>
+                    <a:prstGeom prst="rect"/>
+                  </pic:spPr>
+                </pic:pic>
+              </a:graphicData>
+            </a:graphic>
+          </wp:inline>
+        </w:drawing>
+      </w:r>
+    </w:p>
+    <w:p>
+      <w:pPr>
+        <w:spacing w:after="200"/>
+      </w:pPr>
+      <w:r>
+        <w:rPr>
+          <w:b w:val="0"/>
+          <w:i/>
+          <w:color w:val="555555"/>
+          <w:sz w:val="17"/>
+        </w:rPr>
+        <w:t>Figure 3b. Same outcome, all cells.</w:t>
+      </w:r>
+    </w:p>
+    <w:p>
+      <w:pPr>
+        <w:spacing w:after="60"/>
+      </w:pPr>
+      <w:r>
+        <w:rPr>
+          <w:b/>
+          <w:i w:val="0"/>
+        </w:rPr>
+        <w:t>The same coefficients as a table:</w:t>
       </w:r>
     </w:p>
     <w:tbl>
@@ -14969,7 +15270,72 @@
         <w:pStyle w:val="Heading1"/>
       </w:pPr>
       <w:r>
-        <w:t>8. Figure 4 (as table). IT and business-process services: headcount and under-25 share</w:t>
+        <w:t>8. Figure 4. IT and business-process services: headcount and under-25 share</w:t>
+      </w:r>
+    </w:p>
+    <w:p>
+      <w:pPr>
+        <w:jc w:val="center"/>
+      </w:pPr>
+      <w:r>
+        <w:drawing>
+          <wp:inline xmlns:a="http://schemas.openxmlformats.org/drawingml/2006/main" xmlns:pic="http://schemas.openxmlformats.org/drawingml/2006/picture">
+            <wp:extent cx="6217920" cy="3562350"/>
+            <wp:docPr id="6" name="Picture 6"/>
+            <wp:cNvGraphicFramePr>
+              <a:graphicFrameLocks noChangeAspect="1"/>
+            </wp:cNvGraphicFramePr>
+            <a:graphic>
+              <a:graphicData uri="http://schemas.openxmlformats.org/drawingml/2006/picture">
+                <pic:pic>
+                  <pic:nvPicPr>
+                    <pic:cNvPr id="0" name="itbpo_by_country.png"/>
+                    <pic:cNvPicPr/>
+                  </pic:nvPicPr>
+                  <pic:blipFill>
+                    <a:blip r:embed="rId14"/>
+                    <a:stretch>
+                      <a:fillRect/>
+                    </a:stretch>
+                  </pic:blipFill>
+                  <pic:spPr>
+                    <a:xfrm>
+                      <a:off x="0" y="0"/>
+                      <a:ext cx="6217920" cy="3562350"/>
+                    </a:xfrm>
+                    <a:prstGeom prst="rect"/>
+                  </pic:spPr>
+                </pic:pic>
+              </a:graphicData>
+            </a:graphic>
+          </wp:inline>
+        </w:drawing>
+      </w:r>
+    </w:p>
+    <w:p>
+      <w:pPr>
+        <w:spacing w:after="200"/>
+      </w:pPr>
+      <w:r>
+        <w:rPr>
+          <w:b w:val="0"/>
+          <w:i/>
+          <w:color w:val="555555"/>
+          <w:sz w:val="17"/>
+        </w:rPr>
+        <w:t>Figure 4. Employment in ISIC 62, 63 and 82 indexed to 2022 (sector, its clerical and service occupations, and all employment) and the under-25 share of sector employment against the economy-wide share, annual averages.</w:t>
+      </w:r>
+    </w:p>
+    <w:p>
+      <w:pPr>
+        <w:spacing w:after="60"/>
+      </w:pPr>
+      <w:r>
+        <w:rPr>
+          <w:b/>
+          <w:i w:val="0"/>
+        </w:rPr>
+        <w:t>Summary values as a table:</w:t>
       </w:r>
     </w:p>
     <w:tbl>
@@ -17846,7 +18212,72 @@
         <w:pStyle w:val="Heading1"/>
       </w:pPr>
       <w:r>
-        <w:t>9. Figure 5 (as table). Occupation split within IT and business-process services, 2022 = 100</w:t>
+        <w:t>9. Figure 5. Occupation split within IT and business-process services, 2022 = 100</w:t>
+      </w:r>
+    </w:p>
+    <w:p>
+      <w:pPr>
+        <w:jc w:val="center"/>
+      </w:pPr>
+      <w:r>
+        <w:drawing>
+          <wp:inline xmlns:a="http://schemas.openxmlformats.org/drawingml/2006/main" xmlns:pic="http://schemas.openxmlformats.org/drawingml/2006/picture">
+            <wp:extent cx="6217920" cy="1943100"/>
+            <wp:docPr id="7" name="Picture 7"/>
+            <wp:cNvGraphicFramePr>
+              <a:graphicFrameLocks noChangeAspect="1"/>
+            </wp:cNvGraphicFramePr>
+            <a:graphic>
+              <a:graphicData uri="http://schemas.openxmlformats.org/drawingml/2006/picture">
+                <pic:pic>
+                  <pic:nvPicPr>
+                    <pic:cNvPr id="0" name="itbpo_occupation_split.png"/>
+                    <pic:cNvPicPr/>
+                  </pic:nvPicPr>
+                  <pic:blipFill>
+                    <a:blip r:embed="rId15"/>
+                    <a:stretch>
+                      <a:fillRect/>
+                    </a:stretch>
+                  </pic:blipFill>
+                  <pic:spPr>
+                    <a:xfrm>
+                      <a:off x="0" y="0"/>
+                      <a:ext cx="6217920" cy="1943100"/>
+                    </a:xfrm>
+                    <a:prstGeom prst="rect"/>
+                  </pic:spPr>
+                </pic:pic>
+              </a:graphicData>
+            </a:graphic>
+          </wp:inline>
+        </w:drawing>
+      </w:r>
+    </w:p>
+    <w:p>
+      <w:pPr>
+        <w:spacing w:after="200"/>
+      </w:pPr>
+      <w:r>
+        <w:rPr>
+          <w:b w:val="0"/>
+          <w:i/>
+          <w:color w:val="555555"/>
+          <w:sz w:val="17"/>
+        </w:rPr>
+        <w:t>Figure 5. Within the sector, employment in professional and technical occupations (ISCO 1 to 3) and in clerical and service occupations (ISCO 4 and 5), indexed to 2022, against all employment.</w:t>
+      </w:r>
+    </w:p>
+    <w:p>
+      <w:pPr>
+        <w:spacing w:after="60"/>
+      </w:pPr>
+      <w:r>
+        <w:rPr>
+          <w:b/>
+          <w:i w:val="0"/>
+        </w:rPr>
+        <w:t>The same values as a table:</w:t>
       </w:r>
     </w:p>
     <w:tbl>

</xml_diff>

<commit_message>
Country-by-young event-study subsets and by-country panels for the new-hire share
Co-Authored-By: Claude Fable 5.1 <noreply@anthropic.com>
</commit_message>
<xml_diff>
--- a/docs/design/paper-tables-draft.docx
+++ b/docs/design/paper-tables-draft.docx
@@ -12656,6 +12656,112 @@
     </w:p>
     <w:p>
       <w:pPr>
+        <w:jc w:val="center"/>
+      </w:pPr>
+      <w:r>
+        <w:drawing>
+          <wp:inline xmlns:a="http://schemas.openxmlformats.org/drawingml/2006/main" xmlns:pic="http://schemas.openxmlformats.org/drawingml/2006/picture">
+            <wp:extent cx="6217920" cy="2504440"/>
+            <wp:docPr id="6" name="Picture 6"/>
+            <wp:cNvGraphicFramePr>
+              <a:graphicFrameLocks noChangeAspect="1"/>
+            </wp:cNvGraphicFramePr>
+            <a:graphic>
+              <a:graphicData uri="http://schemas.openxmlformats.org/drawingml/2006/picture">
+                <pic:pic>
+                  <pic:nvPicPr>
+                    <pic:cNvPr id="0" name="es_new_hire_share_panel_country_young.png"/>
+                    <pic:cNvPicPr/>
+                  </pic:nvPicPr>
+                  <pic:blipFill>
+                    <a:blip r:embed="rId14"/>
+                    <a:stretch>
+                      <a:fillRect/>
+                    </a:stretch>
+                  </pic:blipFill>
+                  <pic:spPr>
+                    <a:xfrm>
+                      <a:off x="0" y="0"/>
+                      <a:ext cx="6217920" cy="2504440"/>
+                    </a:xfrm>
+                    <a:prstGeom prst="rect"/>
+                  </pic:spPr>
+                </pic:pic>
+              </a:graphicData>
+            </a:graphic>
+          </wp:inline>
+        </w:drawing>
+      </w:r>
+    </w:p>
+    <w:p>
+      <w:pPr>
+        <w:spacing w:after="200"/>
+      </w:pPr>
+      <w:r>
+        <w:rPr>
+          <w:b w:val="0"/>
+          <w:i/>
+          <w:color w:val="555555"/>
+          <w:sz w:val="17"/>
+        </w:rPr>
+        <w:t>Figure 3c. New-hire share event study by country, cells of workers aged 15 to 29. Each panel re-estimates the model within the country; 95 percent bands. South Africa has 8 clusters and Argentina 13, so their bands are wide.</w:t>
+      </w:r>
+    </w:p>
+    <w:p>
+      <w:pPr>
+        <w:jc w:val="center"/>
+      </w:pPr>
+      <w:r>
+        <w:drawing>
+          <wp:inline xmlns:a="http://schemas.openxmlformats.org/drawingml/2006/main" xmlns:pic="http://schemas.openxmlformats.org/drawingml/2006/picture">
+            <wp:extent cx="6217920" cy="2504440"/>
+            <wp:docPr id="7" name="Picture 7"/>
+            <wp:cNvGraphicFramePr>
+              <a:graphicFrameLocks noChangeAspect="1"/>
+            </wp:cNvGraphicFramePr>
+            <a:graphic>
+              <a:graphicData uri="http://schemas.openxmlformats.org/drawingml/2006/picture">
+                <pic:pic>
+                  <pic:nvPicPr>
+                    <pic:cNvPr id="0" name="es_new_hire_share_panel_country.png"/>
+                    <pic:cNvPicPr/>
+                  </pic:nvPicPr>
+                  <pic:blipFill>
+                    <a:blip r:embed="rId15"/>
+                    <a:stretch>
+                      <a:fillRect/>
+                    </a:stretch>
+                  </pic:blipFill>
+                  <pic:spPr>
+                    <a:xfrm>
+                      <a:off x="0" y="0"/>
+                      <a:ext cx="6217920" cy="2504440"/>
+                    </a:xfrm>
+                    <a:prstGeom prst="rect"/>
+                  </pic:spPr>
+                </pic:pic>
+              </a:graphicData>
+            </a:graphic>
+          </wp:inline>
+        </w:drawing>
+      </w:r>
+    </w:p>
+    <w:p>
+      <w:pPr>
+        <w:spacing w:after="200"/>
+      </w:pPr>
+      <w:r>
+        <w:rPr>
+          <w:b w:val="0"/>
+          <w:i/>
+          <w:color w:val="555555"/>
+          <w:sz w:val="17"/>
+        </w:rPr>
+        <w:t>Figure 3d. New-hire share event study by country, all cells.</w:t>
+      </w:r>
+    </w:p>
+    <w:p>
+      <w:pPr>
         <w:spacing w:after="60"/>
       </w:pPr>
       <w:r>
@@ -14801,8 +14907,9 @@
         <w:tblLook w:firstColumn="1" w:firstRow="1" w:lastColumn="0" w:lastRow="0" w:noHBand="0" w:noVBand="1" w:val="04A0"/>
       </w:tblPr>
       <w:tblGrid>
-        <w:gridCol w:w="4824"/>
-        <w:gridCol w:w="4824"/>
+        <w:gridCol w:w="3216"/>
+        <w:gridCol w:w="3216"/>
+        <w:gridCol w:w="3216"/>
       </w:tblGrid>
       <w:tr>
         <w:tc>
@@ -14825,7 +14932,7 @@
         </w:tc>
         <w:tc>
           <w:tcPr>
-            <w:tcW w:type="dxa" w:w="2880"/>
+            <w:tcW w:type="dxa" w:w="2304"/>
             <w:shd w:val="clear" w:color="auto" w:fill="E7EEF5"/>
           </w:tcPr>
           <w:p>
@@ -14838,7 +14945,26 @@
                 <w:b/>
                 <w:sz w:val="17"/>
               </w:rPr>
-              <w:t>Post × High, new-hire share</w:t>
+              <w:t>Post × High, all cells in sample</w:t>
+            </w:r>
+          </w:p>
+        </w:tc>
+        <w:tc>
+          <w:tcPr>
+            <w:tcW w:type="dxa" w:w="2304"/>
+            <w:shd w:val="clear" w:color="auto" w:fill="E7EEF5"/>
+          </w:tcPr>
+          <w:p>
+            <w:pPr>
+              <w:spacing w:after="0"/>
+              <w:jc w:val="right"/>
+            </w:pPr>
+            <w:r>
+              <w:rPr>
+                <w:b/>
+                <w:sz w:val="17"/>
+              </w:rPr>
+              <w:t>Post × High, young cells only</w:t>
             </w:r>
           </w:p>
         </w:tc>
@@ -14863,7 +14989,7 @@
         </w:tc>
         <w:tc>
           <w:tcPr>
-            <w:tcW w:type="dxa" w:w="2880"/>
+            <w:tcW w:type="dxa" w:w="2304"/>
           </w:tcPr>
           <w:p>
             <w:pPr>
@@ -14876,6 +15002,23 @@
                 <w:sz w:val="17"/>
               </w:rPr>
               <w:t>-0.0062 (0.0022)</w:t>
+            </w:r>
+          </w:p>
+        </w:tc>
+        <w:tc>
+          <w:tcPr>
+            <w:tcW w:type="dxa" w:w="2304"/>
+          </w:tcPr>
+          <w:p>
+            <w:pPr>
+              <w:spacing w:after="0"/>
+              <w:jc w:val="right"/>
+            </w:pPr>
+            <w:r>
+              <w:rPr>
+                <w:b w:val="0"/>
+                <w:sz w:val="17"/>
+              </w:rPr>
             </w:r>
           </w:p>
         </w:tc>
@@ -14900,7 +15043,7 @@
         </w:tc>
         <w:tc>
           <w:tcPr>
-            <w:tcW w:type="dxa" w:w="2880"/>
+            <w:tcW w:type="dxa" w:w="2304"/>
           </w:tcPr>
           <w:p>
             <w:pPr>
@@ -14913,6 +15056,23 @@
                 <w:sz w:val="17"/>
               </w:rPr>
               <w:t>-0.0099 (0.0048)</w:t>
+            </w:r>
+          </w:p>
+        </w:tc>
+        <w:tc>
+          <w:tcPr>
+            <w:tcW w:type="dxa" w:w="2304"/>
+          </w:tcPr>
+          <w:p>
+            <w:pPr>
+              <w:spacing w:after="0"/>
+              <w:jc w:val="right"/>
+            </w:pPr>
+            <w:r>
+              <w:rPr>
+                <w:b w:val="0"/>
+                <w:sz w:val="17"/>
+              </w:rPr>
             </w:r>
           </w:p>
         </w:tc>
@@ -14937,7 +15097,7 @@
         </w:tc>
         <w:tc>
           <w:tcPr>
-            <w:tcW w:type="dxa" w:w="2880"/>
+            <w:tcW w:type="dxa" w:w="2304"/>
           </w:tcPr>
           <w:p>
             <w:pPr>
@@ -14950,6 +15110,23 @@
                 <w:sz w:val="17"/>
               </w:rPr>
               <w:t>-0.0062 (0.0022)</w:t>
+            </w:r>
+          </w:p>
+        </w:tc>
+        <w:tc>
+          <w:tcPr>
+            <w:tcW w:type="dxa" w:w="2304"/>
+          </w:tcPr>
+          <w:p>
+            <w:pPr>
+              <w:spacing w:after="0"/>
+              <w:jc w:val="right"/>
+            </w:pPr>
+            <w:r>
+              <w:rPr>
+                <w:b w:val="0"/>
+                <w:sz w:val="17"/>
+              </w:rPr>
             </w:r>
           </w:p>
         </w:tc>
@@ -14974,7 +15151,7 @@
         </w:tc>
         <w:tc>
           <w:tcPr>
-            <w:tcW w:type="dxa" w:w="2880"/>
+            <w:tcW w:type="dxa" w:w="2304"/>
           </w:tcPr>
           <w:p>
             <w:pPr>
@@ -14987,6 +15164,23 @@
                 <w:sz w:val="17"/>
               </w:rPr>
               <w:t>-0.0036 (0.0047)</w:t>
+            </w:r>
+          </w:p>
+        </w:tc>
+        <w:tc>
+          <w:tcPr>
+            <w:tcW w:type="dxa" w:w="2304"/>
+          </w:tcPr>
+          <w:p>
+            <w:pPr>
+              <w:spacing w:after="0"/>
+              <w:jc w:val="right"/>
+            </w:pPr>
+            <w:r>
+              <w:rPr>
+                <w:b w:val="0"/>
+                <w:sz w:val="17"/>
+              </w:rPr>
             </w:r>
           </w:p>
         </w:tc>
@@ -15011,7 +15205,7 @@
         </w:tc>
         <w:tc>
           <w:tcPr>
-            <w:tcW w:type="dxa" w:w="2880"/>
+            <w:tcW w:type="dxa" w:w="2304"/>
           </w:tcPr>
           <w:p>
             <w:pPr>
@@ -15024,6 +15218,24 @@
                 <w:sz w:val="17"/>
               </w:rPr>
               <w:t>-0.0111 (0.0032)</w:t>
+            </w:r>
+          </w:p>
+        </w:tc>
+        <w:tc>
+          <w:tcPr>
+            <w:tcW w:type="dxa" w:w="2304"/>
+          </w:tcPr>
+          <w:p>
+            <w:pPr>
+              <w:spacing w:after="0"/>
+              <w:jc w:val="right"/>
+            </w:pPr>
+            <w:r>
+              <w:rPr>
+                <w:b w:val="0"/>
+                <w:sz w:val="17"/>
+              </w:rPr>
+              <w:t>-0.0133 (0.0063)</w:t>
             </w:r>
           </w:p>
         </w:tc>
@@ -15048,7 +15260,7 @@
         </w:tc>
         <w:tc>
           <w:tcPr>
-            <w:tcW w:type="dxa" w:w="2880"/>
+            <w:tcW w:type="dxa" w:w="2304"/>
           </w:tcPr>
           <w:p>
             <w:pPr>
@@ -15061,6 +15273,24 @@
                 <w:sz w:val="17"/>
               </w:rPr>
               <w:t>-0.0131 (0.0074)</w:t>
+            </w:r>
+          </w:p>
+        </w:tc>
+        <w:tc>
+          <w:tcPr>
+            <w:tcW w:type="dxa" w:w="2304"/>
+          </w:tcPr>
+          <w:p>
+            <w:pPr>
+              <w:spacing w:after="0"/>
+              <w:jc w:val="right"/>
+            </w:pPr>
+            <w:r>
+              <w:rPr>
+                <w:b w:val="0"/>
+                <w:sz w:val="17"/>
+              </w:rPr>
+              <w:t>-0.0596 (0.0239)</w:t>
             </w:r>
           </w:p>
         </w:tc>
@@ -15085,7 +15315,7 @@
         </w:tc>
         <w:tc>
           <w:tcPr>
-            <w:tcW w:type="dxa" w:w="2880"/>
+            <w:tcW w:type="dxa" w:w="2304"/>
           </w:tcPr>
           <w:p>
             <w:pPr>
@@ -15098,6 +15328,24 @@
                 <w:sz w:val="17"/>
               </w:rPr>
               <w:t>-0.0074 (0.0062)</w:t>
+            </w:r>
+          </w:p>
+        </w:tc>
+        <w:tc>
+          <w:tcPr>
+            <w:tcW w:type="dxa" w:w="2304"/>
+          </w:tcPr>
+          <w:p>
+            <w:pPr>
+              <w:spacing w:after="0"/>
+              <w:jc w:val="right"/>
+            </w:pPr>
+            <w:r>
+              <w:rPr>
+                <w:b w:val="0"/>
+                <w:sz w:val="17"/>
+              </w:rPr>
+              <w:t>-0.0201 (0.0131)</w:t>
             </w:r>
           </w:p>
         </w:tc>
@@ -15122,7 +15370,7 @@
         </w:tc>
         <w:tc>
           <w:tcPr>
-            <w:tcW w:type="dxa" w:w="2880"/>
+            <w:tcW w:type="dxa" w:w="2304"/>
           </w:tcPr>
           <w:p>
             <w:pPr>
@@ -15135,6 +15383,24 @@
                 <w:sz w:val="17"/>
               </w:rPr>
               <w:t>+0.0018 (0.0046)</w:t>
+            </w:r>
+          </w:p>
+        </w:tc>
+        <w:tc>
+          <w:tcPr>
+            <w:tcW w:type="dxa" w:w="2304"/>
+          </w:tcPr>
+          <w:p>
+            <w:pPr>
+              <w:spacing w:after="0"/>
+              <w:jc w:val="right"/>
+            </w:pPr>
+            <w:r>
+              <w:rPr>
+                <w:b w:val="0"/>
+                <w:sz w:val="17"/>
+              </w:rPr>
+              <w:t>-0.0064 (0.0137)</w:t>
             </w:r>
           </w:p>
         </w:tc>
@@ -15159,7 +15425,7 @@
         </w:tc>
         <w:tc>
           <w:tcPr>
-            <w:tcW w:type="dxa" w:w="2880"/>
+            <w:tcW w:type="dxa" w:w="2304"/>
           </w:tcPr>
           <w:p>
             <w:pPr>
@@ -15172,6 +15438,24 @@
                 <w:sz w:val="17"/>
               </w:rPr>
               <w:t>+0.0024 (0.0071)</w:t>
+            </w:r>
+          </w:p>
+        </w:tc>
+        <w:tc>
+          <w:tcPr>
+            <w:tcW w:type="dxa" w:w="2304"/>
+          </w:tcPr>
+          <w:p>
+            <w:pPr>
+              <w:spacing w:after="0"/>
+              <w:jc w:val="right"/>
+            </w:pPr>
+            <w:r>
+              <w:rPr>
+                <w:b w:val="0"/>
+                <w:sz w:val="17"/>
+              </w:rPr>
+              <w:t>+0.0134 (0.0107)</w:t>
             </w:r>
           </w:p>
         </w:tc>
@@ -15196,7 +15480,7 @@
         </w:tc>
         <w:tc>
           <w:tcPr>
-            <w:tcW w:type="dxa" w:w="2880"/>
+            <w:tcW w:type="dxa" w:w="2304"/>
           </w:tcPr>
           <w:p>
             <w:pPr>
@@ -15209,6 +15493,24 @@
                 <w:sz w:val="17"/>
               </w:rPr>
               <w:t>+0.0075 (0.0037)</w:t>
+            </w:r>
+          </w:p>
+        </w:tc>
+        <w:tc>
+          <w:tcPr>
+            <w:tcW w:type="dxa" w:w="2304"/>
+          </w:tcPr>
+          <w:p>
+            <w:pPr>
+              <w:spacing w:after="0"/>
+              <w:jc w:val="right"/>
+            </w:pPr>
+            <w:r>
+              <w:rPr>
+                <w:b w:val="0"/>
+                <w:sz w:val="17"/>
+              </w:rPr>
+              <w:t>+0.0152 (0.0091)</w:t>
             </w:r>
           </w:p>
         </w:tc>
@@ -15233,7 +15535,7 @@
         </w:tc>
         <w:tc>
           <w:tcPr>
-            <w:tcW w:type="dxa" w:w="2880"/>
+            <w:tcW w:type="dxa" w:w="2304"/>
           </w:tcPr>
           <w:p>
             <w:pPr>
@@ -15246,6 +15548,24 @@
                 <w:sz w:val="17"/>
               </w:rPr>
               <w:t>+0.0086 (0.0081)</w:t>
+            </w:r>
+          </w:p>
+        </w:tc>
+        <w:tc>
+          <w:tcPr>
+            <w:tcW w:type="dxa" w:w="2304"/>
+          </w:tcPr>
+          <w:p>
+            <w:pPr>
+              <w:spacing w:after="0"/>
+              <w:jc w:val="right"/>
+            </w:pPr>
+            <w:r>
+              <w:rPr>
+                <w:b w:val="0"/>
+                <w:sz w:val="17"/>
+              </w:rPr>
+              <w:t>-0.0005 (0.0196)</w:t>
             </w:r>
           </w:p>
         </w:tc>
@@ -15281,7 +15601,7 @@
         <w:drawing>
           <wp:inline xmlns:a="http://schemas.openxmlformats.org/drawingml/2006/main" xmlns:pic="http://schemas.openxmlformats.org/drawingml/2006/picture">
             <wp:extent cx="6217920" cy="3562350"/>
-            <wp:docPr id="6" name="Picture 6"/>
+            <wp:docPr id="8" name="Picture 8"/>
             <wp:cNvGraphicFramePr>
               <a:graphicFrameLocks noChangeAspect="1"/>
             </wp:cNvGraphicFramePr>
@@ -15293,7 +15613,7 @@
                     <pic:cNvPicPr/>
                   </pic:nvPicPr>
                   <pic:blipFill>
-                    <a:blip r:embed="rId14"/>
+                    <a:blip r:embed="rId16"/>
                     <a:stretch>
                       <a:fillRect/>
                     </a:stretch>
@@ -18223,7 +18543,7 @@
         <w:drawing>
           <wp:inline xmlns:a="http://schemas.openxmlformats.org/drawingml/2006/main" xmlns:pic="http://schemas.openxmlformats.org/drawingml/2006/picture">
             <wp:extent cx="6217920" cy="1943100"/>
-            <wp:docPr id="7" name="Picture 7"/>
+            <wp:docPr id="9" name="Picture 9"/>
             <wp:cNvGraphicFramePr>
               <a:graphicFrameLocks noChangeAspect="1"/>
             </wp:cNvGraphicFramePr>
@@ -18235,7 +18555,7 @@
                     <pic:cNvPicPr/>
                   </pic:nvPicPr>
                   <pic:blipFill>
-                    <a:blip r:embed="rId15"/>
+                    <a:blip r:embed="rId17"/>
                     <a:stretch>
                       <a:fillRect/>
                     </a:stretch>

</xml_diff>

<commit_message>
Quarterly IT-BPO series for five countries and Philippine leading indicators (PSA monthly sections, IBPAP headcount)
Co-Authored-By: Claude Fable 5.1 <noreply@anthropic.com>
</commit_message>
<xml_diff>
--- a/docs/design/paper-tables-draft.docx
+++ b/docs/design/paper-tables-draft.docx
@@ -15648,6 +15648,112 @@
     </w:p>
     <w:p>
       <w:pPr>
+        <w:jc w:val="center"/>
+      </w:pPr>
+      <w:r>
+        <w:drawing>
+          <wp:inline xmlns:a="http://schemas.openxmlformats.org/drawingml/2006/main" xmlns:pic="http://schemas.openxmlformats.org/drawingml/2006/picture">
+            <wp:extent cx="6217920" cy="1943100"/>
+            <wp:docPr id="9" name="Picture 9"/>
+            <wp:cNvGraphicFramePr>
+              <a:graphicFrameLocks noChangeAspect="1"/>
+            </wp:cNvGraphicFramePr>
+            <a:graphic>
+              <a:graphicData uri="http://schemas.openxmlformats.org/drawingml/2006/picture">
+                <pic:pic>
+                  <pic:nvPicPr>
+                    <pic:cNvPr id="0" name="itbpo_quarterly.png"/>
+                    <pic:cNvPicPr/>
+                  </pic:nvPicPr>
+                  <pic:blipFill>
+                    <a:blip r:embed="rId17"/>
+                    <a:stretch>
+                      <a:fillRect/>
+                    </a:stretch>
+                  </pic:blipFill>
+                  <pic:spPr>
+                    <a:xfrm>
+                      <a:off x="0" y="0"/>
+                      <a:ext cx="6217920" cy="1943100"/>
+                    </a:xfrm>
+                    <a:prstGeom prst="rect"/>
+                  </pic:spPr>
+                </pic:pic>
+              </a:graphicData>
+            </a:graphic>
+          </wp:inline>
+        </w:drawing>
+      </w:r>
+    </w:p>
+    <w:p>
+      <w:pPr>
+        <w:spacing w:after="200"/>
+      </w:pPr>
+      <w:r>
+        <w:rPr>
+          <w:b w:val="0"/>
+          <w:i/>
+          <w:color w:val="555555"/>
+          <w:sz w:val="17"/>
+        </w:rPr>
+        <w:t>Figure 4b. Quarterly version for the five countries whose sector sample supports it (Brazil, Colombia, the Philippines, India, Uruguay) and a pooled series over Brazil, Colombia, the Philippines and Uruguay for quarters where all four are observed (India is left out of the pool: its block is four times the others combined and its sample design changes in 2025). Dashed line at 2022Q4. India before 2025Q2 is first-visit records only.</w:t>
+      </w:r>
+    </w:p>
+    <w:p>
+      <w:pPr>
+        <w:jc w:val="center"/>
+      </w:pPr>
+      <w:r>
+        <w:drawing>
+          <wp:inline xmlns:a="http://schemas.openxmlformats.org/drawingml/2006/main" xmlns:pic="http://schemas.openxmlformats.org/drawingml/2006/picture">
+            <wp:extent cx="6217920" cy="1906829"/>
+            <wp:docPr id="10" name="Picture 10"/>
+            <wp:cNvGraphicFramePr>
+              <a:graphicFrameLocks noChangeAspect="1"/>
+            </wp:cNvGraphicFramePr>
+            <a:graphic>
+              <a:graphicData uri="http://schemas.openxmlformats.org/drawingml/2006/picture">
+                <pic:pic>
+                  <pic:nvPicPr>
+                    <pic:cNvPr id="0" name="phl_sector_leading.png"/>
+                    <pic:cNvPicPr/>
+                  </pic:nvPicPr>
+                  <pic:blipFill>
+                    <a:blip r:embed="rId18"/>
+                    <a:stretch>
+                      <a:fillRect/>
+                    </a:stretch>
+                  </pic:blipFill>
+                  <pic:spPr>
+                    <a:xfrm>
+                      <a:off x="0" y="0"/>
+                      <a:ext cx="6217920" cy="1906829"/>
+                    </a:xfrm>
+                    <a:prstGeom prst="rect"/>
+                  </pic:spPr>
+                </pic:pic>
+              </a:graphicData>
+            </a:graphic>
+          </wp:inline>
+        </w:drawing>
+      </w:r>
+    </w:p>
+    <w:p>
+      <w:pPr>
+        <w:spacing w:after="200"/>
+      </w:pPr>
+      <w:r>
+        <w:rPr>
+          <w:b w:val="0"/>
+          <w:i/>
+          <w:color w:val="555555"/>
+          <w:sz w:val="17"/>
+        </w:rPr>
+        <w:t>Figure 4c. Philippines: recent tabulations. Left: PSA OpenSTAT monthly employment by industry section (J information and communication; N administrative and support, which contains call centres) through July 2026, against the same sections in the harmonised LFS. Centre: the ISIC 62+63+82 block from the harmonised LFS against IBPAP's end-year full-time headcount for the IT-BPM industry (2021 to 2025; 2026 and 2027 forecasts hollow). Right: the under-25 share of the block by quarter.</w:t>
+      </w:r>
+    </w:p>
+    <w:p>
+      <w:pPr>
         <w:spacing w:after="60"/>
       </w:pPr>
       <w:r>
@@ -18543,7 +18649,7 @@
         <w:drawing>
           <wp:inline xmlns:a="http://schemas.openxmlformats.org/drawingml/2006/main" xmlns:pic="http://schemas.openxmlformats.org/drawingml/2006/picture">
             <wp:extent cx="6217920" cy="1943100"/>
-            <wp:docPr id="9" name="Picture 9"/>
+            <wp:docPr id="11" name="Picture 11"/>
             <wp:cNvGraphicFramePr>
               <a:graphicFrameLocks noChangeAspect="1"/>
             </wp:cNvGraphicFramePr>
@@ -18555,7 +18661,7 @@
                     <pic:cNvPicPr/>
                   </pic:nvPicPr>
                   <pic:blipFill>
-                    <a:blip r:embed="rId17"/>
+                    <a:blip r:embed="rId19"/>
                     <a:stretch>
                       <a:fillRect/>
                     </a:stretch>

</xml_diff>